<commit_message>
Assemble the complete thesis according to the editing guide
- thesis_complete.docx: cover, declaration, defence-minutes page, dedication,
  acknowledgements, Persian abstract (rewritten to match the Delphi study),
  table of contents, lists of tables and figures, list of abbreviations,
  chapters 1-5, references (internal/foreign), appendices, English abstract
  and English cover; Persian pages lettered, body pages numbered, title-only
  pages without numbers; B Nazanin/B Titr/Times New Roman sizes, margins,
  captions, footnotes and Word styles as prescribed by the guide.
- chapter2_revised.docx: PRISMA named in Persian with the original in a footnote.
- references_list.docx: Persian entries 12 pt, Latin entries 11 pt (guide sizes).

Co-Authored-By: Claude Sonnet 5.5 <noreply@anthropic.com>
Claude-Session: https://claude.ai/code/session_012d4zYSXkv12fA3MhDxMQzc
</commit_message>
<xml_diff>
--- a/chapter2_revised.docx
+++ b/chapter2_revised.docx
@@ -4400,7 +4400,25 @@
         <w:rPr>
           <w:rtl/>
         </w:rPr>
-        <w:t xml:space="preserve"> نیز در مرور نظام‌مند ۵۲ پژوهش تجربی (مطابق راهنمای PRISMA) میان پذیرش بازاریابی دیجیتال و شاخص‌های رشد بنگاه‌های کوچک و متوسط، از جمله عملکرد فروش، گسترش بازار، حفظ مشتری و آگاهی از برند، رابطه مثبت گزارش کردند و شایستگی مدیریتی را از عوامل تعدیل‌گر این رابطه دانستند.</w:t>
+        <w:t xml:space="preserve"> نیز در مرور نظام‌مند ۵۲ پژوهش تجربی </w:t>
+      </w:r>
+      <w:r>
+        <w:rPr>
+          <w:rtl/>
+        </w:rPr>
+        <w:t xml:space="preserve">(مطابق راهنمای گزارش‌دهی پریزما)</w:t>
+      </w:r>
+      <w:r>
+        <w:rPr>
+          <w:rStyle w:val="FootnoteReference"/>
+        </w:rPr>
+        <w:footnoteReference w:id="21"/>
+      </w:r>
+      <w:r>
+        <w:rPr>
+          <w:rtl/>
+        </w:rPr>
+        <w:t xml:space="preserve"> میان پذیرش بازاریابی دیجیتال و شاخص‌های رشد بنگاه‌های کوچک و متوسط، از جمله عملکرد فروش، گسترش بازار، حفظ مشتری و آگاهی از برند، رابطه مثبت گزارش کردند و شایستگی مدیریتی را از عوامل تعدیل‌گر این رابطه دانستند.</w:t>
       </w:r>
       <w:r>
         <w:rPr>
@@ -4412,7 +4430,7 @@
         <w:rPr>
           <w:rStyle w:val="FootnoteReference"/>
         </w:rPr>
-        <w:footnoteReference w:id="21"/>
+        <w:footnoteReference w:id="22"/>
       </w:r>
       <w:r>
         <w:rPr>
@@ -4448,7 +4466,7 @@
         <w:rPr>
           <w:rStyle w:val="FootnoteReference"/>
         </w:rPr>
-        <w:footnoteReference w:id="22"/>
+        <w:footnoteReference w:id="23"/>
       </w:r>
       <w:r>
         <w:rPr>
@@ -4496,7 +4514,7 @@
         <w:rPr>
           <w:rStyle w:val="FootnoteReference"/>
         </w:rPr>
-        <w:footnoteReference w:id="23"/>
+        <w:footnoteReference w:id="24"/>
       </w:r>
       <w:r>
         <w:rPr>
@@ -4857,7 +4875,7 @@
         <w:rPr>
           <w:rStyle w:val="FootnoteReference"/>
         </w:rPr>
-        <w:footnoteReference w:id="24"/>
+        <w:footnoteReference w:id="25"/>
       </w:r>
       <w:r>
         <w:rPr>
@@ -4930,7 +4948,7 @@
         <w:rPr>
           <w:rStyle w:val="FootnoteReference"/>
         </w:rPr>
-        <w:footnoteReference w:id="25"/>
+        <w:footnoteReference w:id="26"/>
       </w:r>
       <w:r>
         <w:rPr>
@@ -4972,7 +4990,7 @@
         <w:rPr>
           <w:rStyle w:val="FootnoteReference"/>
         </w:rPr>
-        <w:footnoteReference w:id="26"/>
+        <w:footnoteReference w:id="27"/>
       </w:r>
       <w:r>
         <w:rPr>
@@ -5008,7 +5026,7 @@
         <w:rPr>
           <w:rStyle w:val="FootnoteReference"/>
         </w:rPr>
-        <w:footnoteReference w:id="27"/>
+        <w:footnoteReference w:id="28"/>
       </w:r>
       <w:r>
         <w:rPr>
@@ -5201,7 +5219,7 @@
         <w:rPr>
           <w:rStyle w:val="FootnoteReference"/>
         </w:rPr>
-        <w:footnoteReference w:id="28"/>
+        <w:footnoteReference w:id="29"/>
       </w:r>
       <w:r>
         <w:rPr>
@@ -5285,7 +5303,7 @@
         <w:rPr>
           <w:rStyle w:val="FootnoteReference"/>
         </w:rPr>
-        <w:footnoteReference w:id="29"/>
+        <w:footnoteReference w:id="30"/>
       </w:r>
       <w:r>
         <w:rPr>
@@ -5345,7 +5363,7 @@
         <w:rPr>
           <w:rStyle w:val="FootnoteReference"/>
         </w:rPr>
-        <w:footnoteReference w:id="30"/>
+        <w:footnoteReference w:id="31"/>
       </w:r>
       <w:r>
         <w:rPr>
@@ -5393,7 +5411,7 @@
         <w:rPr>
           <w:rStyle w:val="FootnoteReference"/>
         </w:rPr>
-        <w:footnoteReference w:id="31"/>
+        <w:footnoteReference w:id="32"/>
       </w:r>
       <w:r>
         <w:rPr>
@@ -5716,7 +5734,7 @@
         <w:rPr>
           <w:rStyle w:val="FootnoteReference"/>
         </w:rPr>
-        <w:footnoteReference w:id="32"/>
+        <w:footnoteReference w:id="33"/>
       </w:r>
       <w:r>
         <w:rPr>
@@ -5752,7 +5770,7 @@
         <w:rPr>
           <w:rStyle w:val="FootnoteReference"/>
         </w:rPr>
-        <w:footnoteReference w:id="33"/>
+        <w:footnoteReference w:id="34"/>
       </w:r>
       <w:r>
         <w:rPr>
@@ -5794,7 +5812,7 @@
         <w:rPr>
           <w:rStyle w:val="FootnoteReference"/>
         </w:rPr>
-        <w:footnoteReference w:id="34"/>
+        <w:footnoteReference w:id="35"/>
       </w:r>
       <w:r>
         <w:rPr>
@@ -5824,7 +5842,7 @@
         <w:rPr>
           <w:rStyle w:val="FootnoteReference"/>
         </w:rPr>
-        <w:footnoteReference w:id="35"/>
+        <w:footnoteReference w:id="36"/>
       </w:r>
       <w:r>
         <w:rPr>
@@ -6348,7 +6366,7 @@
         <w:rPr>
           <w:rStyle w:val="FootnoteReference"/>
         </w:rPr>
-        <w:footnoteReference w:id="36"/>
+        <w:footnoteReference w:id="37"/>
       </w:r>
       <w:r>
         <w:rPr>
@@ -6390,7 +6408,7 @@
         <w:rPr>
           <w:rStyle w:val="FootnoteReference"/>
         </w:rPr>
-        <w:footnoteReference w:id="37"/>
+        <w:footnoteReference w:id="38"/>
       </w:r>
       <w:r>
         <w:rPr>
@@ -6420,7 +6438,7 @@
         <w:rPr>
           <w:rStyle w:val="FootnoteReference"/>
         </w:rPr>
-        <w:footnoteReference w:id="38"/>
+        <w:footnoteReference w:id="39"/>
       </w:r>
       <w:r>
         <w:rPr>
@@ -6474,7 +6492,7 @@
         <w:rPr>
           <w:rStyle w:val="FootnoteReference"/>
         </w:rPr>
-        <w:footnoteReference w:id="39"/>
+        <w:footnoteReference w:id="40"/>
       </w:r>
       <w:r>
         <w:rPr>
@@ -6564,7 +6582,7 @@
         <w:rPr>
           <w:rStyle w:val="FootnoteReference"/>
         </w:rPr>
-        <w:footnoteReference w:id="40"/>
+        <w:footnoteReference w:id="41"/>
       </w:r>
       <w:r>
         <w:rPr>
@@ -7100,7 +7118,7 @@
         <w:rPr>
           <w:rStyle w:val="FootnoteReference"/>
         </w:rPr>
-        <w:footnoteReference w:id="41"/>
+        <w:footnoteReference w:id="42"/>
       </w:r>
       <w:r>
         <w:rPr>
@@ -7519,7 +7537,7 @@
         <w:rPr>
           <w:rStyle w:val="FootnoteReference"/>
         </w:rPr>
-        <w:footnoteReference w:id="42"/>
+        <w:footnoteReference w:id="43"/>
       </w:r>
       <w:r>
         <w:rPr>
@@ -7993,7 +8011,7 @@
         <w:rPr>
           <w:rStyle w:val="FootnoteReference"/>
         </w:rPr>
-        <w:footnoteReference w:id="43"/>
+        <w:footnoteReference w:id="44"/>
       </w:r>
       <w:r>
         <w:rPr>
@@ -8782,7 +8800,7 @@
         <w:rPr>
           <w:rStyle w:val="FootnoteReference"/>
         </w:rPr>
-        <w:footnoteReference w:id="44"/>
+        <w:footnoteReference w:id="45"/>
       </w:r>
       <w:r>
         <w:rPr>
@@ -8934,7 +8952,7 @@
         <w:rPr>
           <w:rStyle w:val="FootnoteReference"/>
         </w:rPr>
-        <w:footnoteReference w:id="45"/>
+        <w:footnoteReference w:id="46"/>
       </w:r>
       <w:r>
         <w:rPr>
@@ -9438,7 +9456,7 @@
         <w:rPr>
           <w:rStyle w:val="FootnoteReference"/>
         </w:rPr>
-        <w:footnoteReference w:id="46"/>
+        <w:footnoteReference w:id="47"/>
       </w:r>
       <w:r>
         <w:rPr>
@@ -9456,7 +9474,7 @@
         <w:rPr>
           <w:rStyle w:val="FootnoteReference"/>
         </w:rPr>
-        <w:footnoteReference w:id="47"/>
+        <w:footnoteReference w:id="48"/>
       </w:r>
       <w:r>
         <w:rPr>
@@ -9628,7 +9646,7 @@
         <w:rPr>
           <w:rStyle w:val="FootnoteReference"/>
         </w:rPr>
-        <w:footnoteReference w:id="48"/>
+        <w:footnoteReference w:id="49"/>
       </w:r>
       <w:r>
         <w:rPr>
@@ -9664,7 +9682,7 @@
         <w:rPr>
           <w:rStyle w:val="FootnoteReference"/>
         </w:rPr>
-        <w:footnoteReference w:id="49"/>
+        <w:footnoteReference w:id="50"/>
       </w:r>
       <w:r>
         <w:rPr>
@@ -9724,7 +9742,7 @@
         <w:rPr>
           <w:rStyle w:val="FootnoteReference"/>
         </w:rPr>
-        <w:footnoteReference w:id="50"/>
+        <w:footnoteReference w:id="51"/>
       </w:r>
       <w:r>
         <w:rPr>
@@ -9820,7 +9838,7 @@
         <w:rPr>
           <w:rStyle w:val="FootnoteReference"/>
         </w:rPr>
-        <w:footnoteReference w:id="51"/>
+        <w:footnoteReference w:id="52"/>
       </w:r>
       <w:r>
         <w:rPr>
@@ -9856,7 +9874,7 @@
         <w:rPr>
           <w:rStyle w:val="FootnoteReference"/>
         </w:rPr>
-        <w:footnoteReference w:id="52"/>
+        <w:footnoteReference w:id="53"/>
       </w:r>
       <w:r>
         <w:rPr>
@@ -10210,7 +10228,7 @@
         <w:rPr>
           <w:rStyle w:val="FootnoteReference"/>
         </w:rPr>
-        <w:footnoteReference w:id="53"/>
+        <w:footnoteReference w:id="54"/>
       </w:r>
       <w:r>
         <w:rPr>
@@ -10300,7 +10318,7 @@
         <w:rPr>
           <w:rStyle w:val="FootnoteReference"/>
         </w:rPr>
-        <w:footnoteReference w:id="54"/>
+        <w:footnoteReference w:id="55"/>
       </w:r>
       <w:r>
         <w:rPr>
@@ -10312,7 +10330,7 @@
         <w:rPr>
           <w:rStyle w:val="FootnoteReference"/>
         </w:rPr>
-        <w:footnoteReference w:id="55"/>
+        <w:footnoteReference w:id="56"/>
       </w:r>
       <w:r>
         <w:rPr>
@@ -10324,7 +10342,7 @@
         <w:rPr>
           <w:rStyle w:val="FootnoteReference"/>
         </w:rPr>
-        <w:footnoteReference w:id="56"/>
+        <w:footnoteReference w:id="57"/>
       </w:r>
       <w:r>
         <w:rPr>
@@ -10372,7 +10390,7 @@
         <w:rPr>
           <w:rStyle w:val="FootnoteReference"/>
         </w:rPr>
-        <w:footnoteReference w:id="57"/>
+        <w:footnoteReference w:id="58"/>
       </w:r>
       <w:r>
         <w:rPr>
@@ -10537,7 +10555,7 @@
         <w:rPr>
           <w:rStyle w:val="FootnoteReference"/>
         </w:rPr>
-        <w:footnoteReference w:id="58"/>
+        <w:footnoteReference w:id="59"/>
       </w:r>
       <w:r>
         <w:rPr>
@@ -11065,7 +11083,7 @@
         <w:rPr>
           <w:rStyle w:val="FootnoteReference"/>
         </w:rPr>
-        <w:footnoteReference w:id="59"/>
+        <w:footnoteReference w:id="60"/>
       </w:r>
       <w:r>
         <w:rPr>
@@ -11114,7 +11132,7 @@
         <w:rPr>
           <w:rStyle w:val="FootnoteReference"/>
         </w:rPr>
-        <w:footnoteReference w:id="60"/>
+        <w:footnoteReference w:id="61"/>
       </w:r>
       <w:r>
         <w:rPr>
@@ -11162,7 +11180,7 @@
         <w:rPr>
           <w:rStyle w:val="FootnoteReference"/>
         </w:rPr>
-        <w:footnoteReference w:id="61"/>
+        <w:footnoteReference w:id="62"/>
       </w:r>
       <w:r>
         <w:rPr>
@@ -11174,7 +11192,7 @@
         <w:rPr>
           <w:rStyle w:val="FootnoteReference"/>
         </w:rPr>
-        <w:footnoteReference w:id="62"/>
+        <w:footnoteReference w:id="63"/>
       </w:r>
       <w:r>
         <w:rPr>
@@ -11198,7 +11216,7 @@
         <w:rPr>
           <w:rStyle w:val="FootnoteReference"/>
         </w:rPr>
-        <w:footnoteReference w:id="63"/>
+        <w:footnoteReference w:id="64"/>
       </w:r>
       <w:r>
         <w:rPr>
@@ -11234,7 +11252,7 @@
         <w:rPr>
           <w:rStyle w:val="FootnoteReference"/>
         </w:rPr>
-        <w:footnoteReference w:id="64"/>
+        <w:footnoteReference w:id="65"/>
       </w:r>
       <w:r>
         <w:rPr>
@@ -11258,7 +11276,7 @@
         <w:rPr>
           <w:rStyle w:val="FootnoteReference"/>
         </w:rPr>
-        <w:footnoteReference w:id="65"/>
+        <w:footnoteReference w:id="66"/>
       </w:r>
       <w:r>
         <w:rPr>
@@ -11294,7 +11312,7 @@
         <w:rPr>
           <w:rStyle w:val="FootnoteReference"/>
         </w:rPr>
-        <w:footnoteReference w:id="66"/>
+        <w:footnoteReference w:id="67"/>
       </w:r>
       <w:r>
         <w:rPr>
@@ -11589,7 +11607,7 @@
         <w:rPr>
           <w:rStyle w:val="FootnoteReference"/>
         </w:rPr>
-        <w:footnoteReference w:id="67"/>
+        <w:footnoteReference w:id="68"/>
       </w:r>
       <w:r>
         <w:rPr>
@@ -11637,7 +11655,7 @@
         <w:rPr>
           <w:rStyle w:val="FootnoteReference"/>
         </w:rPr>
-        <w:footnoteReference w:id="68"/>
+        <w:footnoteReference w:id="69"/>
       </w:r>
       <w:r>
         <w:rPr>
@@ -11673,7 +11691,7 @@
         <w:rPr>
           <w:rStyle w:val="FootnoteReference"/>
         </w:rPr>
-        <w:footnoteReference w:id="69"/>
+        <w:footnoteReference w:id="70"/>
       </w:r>
       <w:r>
         <w:rPr>
@@ -11697,7 +11715,7 @@
         <w:rPr>
           <w:rStyle w:val="FootnoteReference"/>
         </w:rPr>
-        <w:footnoteReference w:id="70"/>
+        <w:footnoteReference w:id="71"/>
       </w:r>
       <w:r>
         <w:rPr>
@@ -11727,7 +11745,7 @@
         <w:rPr>
           <w:rStyle w:val="FootnoteReference"/>
         </w:rPr>
-        <w:footnoteReference w:id="71"/>
+        <w:footnoteReference w:id="72"/>
       </w:r>
       <w:r>
         <w:rPr>
@@ -11757,7 +11775,7 @@
         <w:rPr>
           <w:rStyle w:val="FootnoteReference"/>
         </w:rPr>
-        <w:footnoteReference w:id="72"/>
+        <w:footnoteReference w:id="73"/>
       </w:r>
       <w:r>
         <w:rPr>
@@ -12157,7 +12175,7 @@
         <w:rPr>
           <w:rStyle w:val="FootnoteReference"/>
         </w:rPr>
-        <w:footnoteReference w:id="73"/>
+        <w:footnoteReference w:id="74"/>
       </w:r>
       <w:r>
         <w:rPr>
@@ -12388,7 +12406,7 @@
         <w:rPr>
           <w:rStyle w:val="FootnoteReference"/>
         </w:rPr>
-        <w:footnoteReference w:id="74"/>
+        <w:footnoteReference w:id="75"/>
       </w:r>
       <w:r>
         <w:rPr>
@@ -12400,7 +12418,7 @@
         <w:rPr>
           <w:rStyle w:val="FootnoteReference"/>
         </w:rPr>
-        <w:footnoteReference w:id="75"/>
+        <w:footnoteReference w:id="76"/>
       </w:r>
       <w:r>
         <w:rPr>
@@ -12424,7 +12442,7 @@
         <w:rPr>
           <w:rStyle w:val="FootnoteReference"/>
         </w:rPr>
-        <w:footnoteReference w:id="76"/>
+        <w:footnoteReference w:id="77"/>
       </w:r>
       <w:r>
         <w:rPr>
@@ -12505,7 +12523,7 @@
         <w:rPr>
           <w:rStyle w:val="FootnoteReference"/>
         </w:rPr>
-        <w:footnoteReference w:id="77"/>
+        <w:footnoteReference w:id="78"/>
       </w:r>
       <w:r>
         <w:rPr>
@@ -12958,7 +12976,7 @@
         <w:rPr>
           <w:rStyle w:val="FootnoteReference"/>
         </w:rPr>
-        <w:footnoteReference w:id="78"/>
+        <w:footnoteReference w:id="79"/>
       </w:r>
       <w:r>
         <w:rPr>
@@ -12982,7 +13000,7 @@
         <w:rPr>
           <w:rStyle w:val="FootnoteReference"/>
         </w:rPr>
-        <w:footnoteReference w:id="79"/>
+        <w:footnoteReference w:id="80"/>
       </w:r>
       <w:r>
         <w:rPr>
@@ -14546,7 +14564,7 @@
         <w:rPr>
           <w:rStyle w:val="FootnoteReference"/>
         </w:rPr>
-        <w:footnoteReference w:id="80"/>
+        <w:footnoteReference w:id="81"/>
       </w:r>
       <w:r>
         <w:rPr>
@@ -14577,7 +14595,7 @@
         <w:rPr>
           <w:rStyle w:val="FootnoteReference"/>
         </w:rPr>
-        <w:footnoteReference w:id="81"/>
+        <w:footnoteReference w:id="82"/>
       </w:r>
       <w:r>
         <w:rPr>
@@ -14732,7 +14750,7 @@
         <w:rPr>
           <w:rStyle w:val="FootnoteReference"/>
         </w:rPr>
-        <w:footnoteReference w:id="82"/>
+        <w:footnoteReference w:id="83"/>
       </w:r>
       <w:r>
         <w:rPr>
@@ -15184,7 +15202,7 @@
           <w:sz w:val="20"/>
           <w:szCs w:val="20"/>
         </w:rPr>
-        <w:t xml:space="preserve"> Taneo et al., 2022</w:t>
+        <w:t xml:space="preserve"> Preferred Reporting Items for Systematic Reviews and Meta-Analyses (PRISMA)</w:t>
       </w:r>
     </w:p>
   </w:footnote>
@@ -15202,7 +15220,7 @@
           <w:sz w:val="20"/>
           <w:szCs w:val="20"/>
         </w:rPr>
-        <w:t xml:space="preserve"> Dukhaykh &amp; Alangri, 2026</w:t>
+        <w:t xml:space="preserve"> Taneo et al., 2022</w:t>
       </w:r>
     </w:p>
   </w:footnote>
@@ -15220,7 +15238,7 @@
           <w:sz w:val="20"/>
           <w:szCs w:val="20"/>
         </w:rPr>
-        <w:t xml:space="preserve"> Williams &amp; Aaron, 2018</w:t>
+        <w:t xml:space="preserve"> Dukhaykh &amp; Alangri, 2026</w:t>
       </w:r>
     </w:p>
   </w:footnote>
@@ -15238,7 +15256,7 @@
           <w:sz w:val="20"/>
           <w:szCs w:val="20"/>
         </w:rPr>
-        <w:t xml:space="preserve"> Pangarkar &amp; Prabhudesai, 2024</w:t>
+        <w:t xml:space="preserve"> Williams &amp; Aaron, 2018</w:t>
       </w:r>
     </w:p>
   </w:footnote>
@@ -15256,7 +15274,7 @@
           <w:sz w:val="20"/>
           <w:szCs w:val="20"/>
         </w:rPr>
-        <w:t xml:space="preserve"> Mangla et al., 2021</w:t>
+        <w:t xml:space="preserve"> Pangarkar &amp; Prabhudesai, 2024</w:t>
       </w:r>
     </w:p>
   </w:footnote>
@@ -15274,7 +15292,7 @@
           <w:sz w:val="20"/>
           <w:szCs w:val="20"/>
         </w:rPr>
-        <w:t xml:space="preserve"> Sharabati et al., 2024</w:t>
+        <w:t xml:space="preserve"> Mangla et al., 2021</w:t>
       </w:r>
     </w:p>
   </w:footnote>
@@ -15292,7 +15310,7 @@
           <w:sz w:val="20"/>
           <w:szCs w:val="20"/>
         </w:rPr>
-        <w:t xml:space="preserve"> Taneo et al., 2022</w:t>
+        <w:t xml:space="preserve"> Sharabati et al., 2024</w:t>
       </w:r>
     </w:p>
   </w:footnote>
@@ -15310,7 +15328,7 @@
           <w:sz w:val="20"/>
           <w:szCs w:val="20"/>
         </w:rPr>
-        <w:t xml:space="preserve"> Mammen et al., 2021</w:t>
+        <w:t xml:space="preserve"> Taneo et al., 2022</w:t>
       </w:r>
     </w:p>
   </w:footnote>
@@ -15328,7 +15346,7 @@
           <w:sz w:val="20"/>
           <w:szCs w:val="20"/>
         </w:rPr>
-        <w:t xml:space="preserve"> Dukhaykh &amp; Alangri, 2026</w:t>
+        <w:t xml:space="preserve"> Mammen et al., 2021</w:t>
       </w:r>
     </w:p>
   </w:footnote>
@@ -15346,7 +15364,7 @@
           <w:sz w:val="20"/>
           <w:szCs w:val="20"/>
         </w:rPr>
-        <w:t xml:space="preserve"> Arte &amp; Larimo, 2022</w:t>
+        <w:t xml:space="preserve"> Dukhaykh &amp; Alangri, 2026</w:t>
       </w:r>
     </w:p>
   </w:footnote>
@@ -15382,7 +15400,7 @@
           <w:sz w:val="20"/>
           <w:szCs w:val="20"/>
         </w:rPr>
-        <w:t xml:space="preserve"> Schommer et al., 2019</w:t>
+        <w:t xml:space="preserve"> Arte &amp; Larimo, 2022</w:t>
       </w:r>
     </w:p>
   </w:footnote>
@@ -15400,7 +15418,7 @@
           <w:sz w:val="20"/>
           <w:szCs w:val="20"/>
         </w:rPr>
-        <w:t xml:space="preserve"> Mammen et al., 2021</w:t>
+        <w:t xml:space="preserve"> Schommer et al., 2019</w:t>
       </w:r>
     </w:p>
   </w:footnote>
@@ -15418,7 +15436,7 @@
           <w:sz w:val="20"/>
           <w:szCs w:val="20"/>
         </w:rPr>
-        <w:t xml:space="preserve"> Arte &amp; Larimo, 2022</w:t>
+        <w:t xml:space="preserve"> Mammen et al., 2021</w:t>
       </w:r>
     </w:p>
   </w:footnote>
@@ -15436,7 +15454,7 @@
           <w:sz w:val="20"/>
           <w:szCs w:val="20"/>
         </w:rPr>
-        <w:t xml:space="preserve"> Mammen et al., 2021</w:t>
+        <w:t xml:space="preserve"> Arte &amp; Larimo, 2022</w:t>
       </w:r>
     </w:p>
   </w:footnote>
@@ -15454,7 +15472,7 @@
           <w:sz w:val="20"/>
           <w:szCs w:val="20"/>
         </w:rPr>
-        <w:t xml:space="preserve"> Schommer et al., 2019</w:t>
+        <w:t xml:space="preserve"> Mammen et al., 2021</w:t>
       </w:r>
     </w:p>
   </w:footnote>
@@ -15472,7 +15490,7 @@
           <w:sz w:val="20"/>
           <w:szCs w:val="20"/>
         </w:rPr>
-        <w:t xml:space="preserve"> Williams &amp; Aaron, 2018</w:t>
+        <w:t xml:space="preserve"> Schommer et al., 2019</w:t>
       </w:r>
     </w:p>
   </w:footnote>
@@ -15490,7 +15508,7 @@
           <w:sz w:val="20"/>
           <w:szCs w:val="20"/>
         </w:rPr>
-        <w:t xml:space="preserve"> Mammen et al., 2021</w:t>
+        <w:t xml:space="preserve"> Williams &amp; Aaron, 2018</w:t>
       </w:r>
     </w:p>
   </w:footnote>
@@ -15508,7 +15526,7 @@
           <w:sz w:val="20"/>
           <w:szCs w:val="20"/>
         </w:rPr>
-        <w:t xml:space="preserve"> Dukhaykh &amp; Alangri, 2026</w:t>
+        <w:t xml:space="preserve"> Mammen et al., 2021</w:t>
       </w:r>
     </w:p>
   </w:footnote>
@@ -15526,7 +15544,7 @@
           <w:sz w:val="20"/>
           <w:szCs w:val="20"/>
         </w:rPr>
-        <w:t xml:space="preserve"> Kero &amp; Bogale, 2023</w:t>
+        <w:t xml:space="preserve"> Dukhaykh &amp; Alangri, 2026</w:t>
       </w:r>
     </w:p>
   </w:footnote>
@@ -15544,7 +15562,7 @@
           <w:sz w:val="20"/>
           <w:szCs w:val="20"/>
         </w:rPr>
-        <w:t xml:space="preserve"> Taneo et al., 2022</w:t>
+        <w:t xml:space="preserve"> Kero &amp; Bogale, 2023</w:t>
       </w:r>
     </w:p>
   </w:footnote>
@@ -15562,7 +15580,7 @@
           <w:sz w:val="20"/>
           <w:szCs w:val="20"/>
         </w:rPr>
-        <w:t xml:space="preserve"> Dukhaykh &amp; Alangri, 2026</w:t>
+        <w:t xml:space="preserve"> Taneo et al., 2022</w:t>
       </w:r>
     </w:p>
   </w:footnote>
@@ -15580,7 +15598,7 @@
           <w:sz w:val="20"/>
           <w:szCs w:val="20"/>
         </w:rPr>
-        <w:t xml:space="preserve"> Miklian &amp; Hoelscher, 2022</w:t>
+        <w:t xml:space="preserve"> Dukhaykh &amp; Alangri, 2026</w:t>
       </w:r>
     </w:p>
   </w:footnote>
@@ -15616,7 +15634,7 @@
           <w:sz w:val="20"/>
           <w:szCs w:val="20"/>
         </w:rPr>
-        <w:t xml:space="preserve"> Mammen et al., 2021</w:t>
+        <w:t xml:space="preserve"> Miklian &amp; Hoelscher, 2022</w:t>
       </w:r>
     </w:p>
   </w:footnote>
@@ -15634,7 +15652,7 @@
           <w:sz w:val="20"/>
           <w:szCs w:val="20"/>
         </w:rPr>
-        <w:t xml:space="preserve"> Arte &amp; Larimo, 2022</w:t>
+        <w:t xml:space="preserve"> Mammen et al., 2021</w:t>
       </w:r>
     </w:p>
   </w:footnote>
@@ -15652,7 +15670,7 @@
           <w:sz w:val="20"/>
           <w:szCs w:val="20"/>
         </w:rPr>
-        <w:t xml:space="preserve"> Mammen et al., 2021</w:t>
+        <w:t xml:space="preserve"> Arte &amp; Larimo, 2022</w:t>
       </w:r>
     </w:p>
   </w:footnote>
@@ -15670,7 +15688,7 @@
           <w:sz w:val="20"/>
           <w:szCs w:val="20"/>
         </w:rPr>
-        <w:t xml:space="preserve"> Singh et al., 2022</w:t>
+        <w:t xml:space="preserve"> Mammen et al., 2021</w:t>
       </w:r>
     </w:p>
   </w:footnote>
@@ -15688,7 +15706,7 @@
           <w:sz w:val="20"/>
           <w:szCs w:val="20"/>
         </w:rPr>
-        <w:t xml:space="preserve"> Mangla et al., 2021</w:t>
+        <w:t xml:space="preserve"> Singh et al., 2022</w:t>
       </w:r>
     </w:p>
   </w:footnote>
@@ -15706,7 +15724,7 @@
           <w:sz w:val="20"/>
           <w:szCs w:val="20"/>
         </w:rPr>
-        <w:t xml:space="preserve"> Shah et al., 2023</w:t>
+        <w:t xml:space="preserve"> Mangla et al., 2021</w:t>
       </w:r>
     </w:p>
   </w:footnote>
@@ -15724,7 +15742,7 @@
           <w:sz w:val="20"/>
           <w:szCs w:val="20"/>
         </w:rPr>
-        <w:t xml:space="preserve"> Singh et al., 2022</w:t>
+        <w:t xml:space="preserve"> Shah et al., 2023</w:t>
       </w:r>
     </w:p>
   </w:footnote>
@@ -15760,7 +15778,7 @@
           <w:sz w:val="20"/>
           <w:szCs w:val="20"/>
         </w:rPr>
-        <w:t xml:space="preserve"> Mangla et al., 2021</w:t>
+        <w:t xml:space="preserve"> Singh et al., 2022</w:t>
       </w:r>
     </w:p>
   </w:footnote>
@@ -15778,7 +15796,7 @@
           <w:sz w:val="20"/>
           <w:szCs w:val="20"/>
         </w:rPr>
-        <w:t xml:space="preserve"> Kero &amp; Bogale, 2023</w:t>
+        <w:t xml:space="preserve"> Mangla et al., 2021</w:t>
       </w:r>
     </w:p>
   </w:footnote>
@@ -15796,7 +15814,7 @@
           <w:sz w:val="20"/>
           <w:szCs w:val="20"/>
         </w:rPr>
-        <w:t xml:space="preserve"> Pangarkar &amp; Prabhudesai, 2024</w:t>
+        <w:t xml:space="preserve"> Kero &amp; Bogale, 2023</w:t>
       </w:r>
     </w:p>
   </w:footnote>
@@ -15814,7 +15832,7 @@
           <w:sz w:val="20"/>
           <w:szCs w:val="20"/>
         </w:rPr>
-        <w:t xml:space="preserve"> Mammen et al., 2021</w:t>
+        <w:t xml:space="preserve"> Pangarkar &amp; Prabhudesai, 2024</w:t>
       </w:r>
     </w:p>
   </w:footnote>
@@ -15832,7 +15850,7 @@
           <w:sz w:val="20"/>
           <w:szCs w:val="20"/>
         </w:rPr>
-        <w:t xml:space="preserve"> Naeem et al., 2023</w:t>
+        <w:t xml:space="preserve"> Mammen et al., 2021</w:t>
       </w:r>
     </w:p>
   </w:footnote>
@@ -15850,7 +15868,7 @@
           <w:sz w:val="20"/>
           <w:szCs w:val="20"/>
         </w:rPr>
-        <w:t xml:space="preserve"> Dukhaykh &amp; Alangri, 2026</w:t>
+        <w:t xml:space="preserve"> Naeem et al., 2023</w:t>
       </w:r>
     </w:p>
   </w:footnote>
@@ -15868,7 +15886,7 @@
           <w:sz w:val="20"/>
           <w:szCs w:val="20"/>
         </w:rPr>
-        <w:t xml:space="preserve"> Zain et al., 2023</w:t>
+        <w:t xml:space="preserve"> Dukhaykh &amp; Alangri, 2026</w:t>
       </w:r>
     </w:p>
   </w:footnote>
@@ -15886,7 +15904,7 @@
           <w:sz w:val="20"/>
           <w:szCs w:val="20"/>
         </w:rPr>
-        <w:t xml:space="preserve"> Mammen et al., 2021</w:t>
+        <w:t xml:space="preserve"> Zain et al., 2023</w:t>
       </w:r>
     </w:p>
   </w:footnote>
@@ -15904,7 +15922,7 @@
           <w:sz w:val="20"/>
           <w:szCs w:val="20"/>
         </w:rPr>
-        <w:t xml:space="preserve"> Azam et al., 2021</w:t>
+        <w:t xml:space="preserve"> Mammen et al., 2021</w:t>
       </w:r>
     </w:p>
   </w:footnote>
@@ -15922,7 +15940,7 @@
           <w:sz w:val="20"/>
           <w:szCs w:val="20"/>
         </w:rPr>
-        <w:t xml:space="preserve"> Mangla et al., 2021</w:t>
+        <w:t xml:space="preserve"> Azam et al., 2021</w:t>
       </w:r>
     </w:p>
   </w:footnote>
@@ -15940,7 +15958,7 @@
           <w:sz w:val="20"/>
           <w:szCs w:val="20"/>
         </w:rPr>
-        <w:t xml:space="preserve"> Schommer et al., 2019</w:t>
+        <w:t xml:space="preserve"> Mangla et al., 2021</w:t>
       </w:r>
     </w:p>
   </w:footnote>
@@ -15958,7 +15976,7 @@
           <w:sz w:val="20"/>
           <w:szCs w:val="20"/>
         </w:rPr>
-        <w:t xml:space="preserve"> Arte &amp; Larimo, 2022</w:t>
+        <w:t xml:space="preserve"> Schommer et al., 2019</w:t>
       </w:r>
     </w:p>
   </w:footnote>
@@ -15976,7 +15994,7 @@
           <w:sz w:val="20"/>
           <w:szCs w:val="20"/>
         </w:rPr>
-        <w:t xml:space="preserve"> Williams &amp; Aaron, 2018</w:t>
+        <w:t xml:space="preserve"> Arte &amp; Larimo, 2022</w:t>
       </w:r>
     </w:p>
   </w:footnote>
@@ -15994,7 +16012,7 @@
           <w:sz w:val="20"/>
           <w:szCs w:val="20"/>
         </w:rPr>
-        <w:t xml:space="preserve"> Shah et al., 2023</w:t>
+        <w:t xml:space="preserve"> Williams &amp; Aaron, 2018</w:t>
       </w:r>
     </w:p>
   </w:footnote>
@@ -16012,7 +16030,7 @@
           <w:sz w:val="20"/>
           <w:szCs w:val="20"/>
         </w:rPr>
-        <w:t xml:space="preserve"> Gupta &amp; Jagtap, 2024</w:t>
+        <w:t xml:space="preserve"> Shah et al., 2023</w:t>
       </w:r>
     </w:p>
   </w:footnote>
@@ -16030,7 +16048,7 @@
           <w:sz w:val="20"/>
           <w:szCs w:val="20"/>
         </w:rPr>
-        <w:t xml:space="preserve"> Miklian &amp; Hoelscher, 2022</w:t>
+        <w:t xml:space="preserve"> Gupta &amp; Jagtap, 2024</w:t>
       </w:r>
     </w:p>
   </w:footnote>
@@ -16048,7 +16066,7 @@
           <w:sz w:val="20"/>
           <w:szCs w:val="20"/>
         </w:rPr>
-        <w:t xml:space="preserve"> Thomran et al., 2022</w:t>
+        <w:t xml:space="preserve"> Miklian &amp; Hoelscher, 2022</w:t>
       </w:r>
     </w:p>
   </w:footnote>
@@ -16066,7 +16084,7 @@
           <w:sz w:val="20"/>
           <w:szCs w:val="20"/>
         </w:rPr>
-        <w:t xml:space="preserve"> Sharabati et al., 2024</w:t>
+        <w:t xml:space="preserve"> Thomran et al., 2022</w:t>
       </w:r>
     </w:p>
   </w:footnote>
@@ -16084,7 +16102,7 @@
           <w:sz w:val="20"/>
           <w:szCs w:val="20"/>
         </w:rPr>
-        <w:t xml:space="preserve"> Landjohou &amp; Christopher, 2026</w:t>
+        <w:t xml:space="preserve"> Sharabati et al., 2024</w:t>
       </w:r>
     </w:p>
   </w:footnote>
@@ -16102,7 +16120,7 @@
           <w:sz w:val="20"/>
           <w:szCs w:val="20"/>
         </w:rPr>
-        <w:t xml:space="preserve"> Singh et al., 2022</w:t>
+        <w:t xml:space="preserve"> Landjohou &amp; Christopher, 2026</w:t>
       </w:r>
     </w:p>
   </w:footnote>
@@ -16120,7 +16138,7 @@
           <w:sz w:val="20"/>
           <w:szCs w:val="20"/>
         </w:rPr>
-        <w:t xml:space="preserve"> Taneo et al., 2022</w:t>
+        <w:t xml:space="preserve"> Singh et al., 2022</w:t>
       </w:r>
     </w:p>
   </w:footnote>
@@ -16138,7 +16156,7 @@
           <w:sz w:val="20"/>
           <w:szCs w:val="20"/>
         </w:rPr>
-        <w:t xml:space="preserve"> Dukhaykh &amp; Alangri, 2026</w:t>
+        <w:t xml:space="preserve"> Taneo et al., 2022</w:t>
       </w:r>
     </w:p>
   </w:footnote>
@@ -16156,7 +16174,7 @@
           <w:sz w:val="20"/>
           <w:szCs w:val="20"/>
         </w:rPr>
-        <w:t xml:space="preserve"> Shah et al., 2023</w:t>
+        <w:t xml:space="preserve"> Dukhaykh &amp; Alangri, 2026</w:t>
       </w:r>
     </w:p>
   </w:footnote>
@@ -16174,7 +16192,7 @@
           <w:sz w:val="20"/>
           <w:szCs w:val="20"/>
         </w:rPr>
-        <w:t xml:space="preserve"> Naeem et al., 2023</w:t>
+        <w:t xml:space="preserve"> Shah et al., 2023</w:t>
       </w:r>
     </w:p>
   </w:footnote>
@@ -16192,7 +16210,7 @@
           <w:sz w:val="20"/>
           <w:szCs w:val="20"/>
         </w:rPr>
-        <w:t xml:space="preserve"> Shah et al., 2023</w:t>
+        <w:t xml:space="preserve"> Naeem et al., 2023</w:t>
       </w:r>
     </w:p>
   </w:footnote>
@@ -16210,7 +16228,7 @@
           <w:sz w:val="20"/>
           <w:szCs w:val="20"/>
         </w:rPr>
-        <w:t xml:space="preserve"> Dukhaykh &amp; Alangri, 2026</w:t>
+        <w:t xml:space="preserve"> Shah et al., 2023</w:t>
       </w:r>
     </w:p>
   </w:footnote>
@@ -16228,7 +16246,7 @@
           <w:sz w:val="20"/>
           <w:szCs w:val="20"/>
         </w:rPr>
-        <w:t xml:space="preserve"> Gupta &amp; Jagtap, 2024</w:t>
+        <w:t xml:space="preserve"> Dukhaykh &amp; Alangri, 2026</w:t>
       </w:r>
     </w:p>
   </w:footnote>
@@ -16246,7 +16264,7 @@
           <w:sz w:val="20"/>
           <w:szCs w:val="20"/>
         </w:rPr>
-        <w:t xml:space="preserve"> Kero &amp; Bogale, 2023</w:t>
+        <w:t xml:space="preserve"> Gupta &amp; Jagtap, 2024</w:t>
       </w:r>
     </w:p>
   </w:footnote>
@@ -16264,11 +16282,29 @@
           <w:sz w:val="20"/>
           <w:szCs w:val="20"/>
         </w:rPr>
-        <w:t xml:space="preserve"> Pangarkar &amp; Prabhudesai, 2024</w:t>
+        <w:t xml:space="preserve"> Kero &amp; Bogale, 2023</w:t>
       </w:r>
     </w:p>
   </w:footnote>
   <w:footnote w:id="82">
+    <w:p>
+      <w:r>
+        <w:rPr>
+          <w:rStyle w:val="FootnoteReference"/>
+        </w:rPr>
+        <w:footnoteRef/>
+      </w:r>
+      <w:r>
+        <w:rPr>
+          <w:rFonts w:ascii="Times New Roman" w:eastAsia="Times New Roman" w:hAnsi="Times New Roman" w:cs="Times New Roman"/>
+          <w:sz w:val="20"/>
+          <w:szCs w:val="20"/>
+        </w:rPr>
+        <w:t xml:space="preserve"> Pangarkar &amp; Prabhudesai, 2024</w:t>
+      </w:r>
+    </w:p>
+  </w:footnote>
+  <w:footnote w:id="83">
     <w:p>
       <w:r>
         <w:rPr>

</xml_diff>

<commit_message>
Keep only the blank questionnaire forms in the appendices
- Appendix الف, ب and پ now hold the raw forms of Delphi rounds one, two
  and three; the completed answers and the statistical outputs are no
  longer in the appendices, and the food-industry appendix is removed
  together with its reference in chapter 2
- Update the appendix references in chapter 3, and the round-three
  paragraph in chapter 4, to point to the raw forms
- In the AHP table, state that items with equal overall weight share a
  rank, and write the number of items in words

Claude-Session: https://claude.ai/code/session_012d4zYSXkv12fA3MhDxMQzc
</commit_message>
<xml_diff>
--- a/chapter2_revised.docx
+++ b/chapter2_revised.docx
@@ -9760,43 +9760,25 @@
         <w:rPr>
           <w:rtl/>
         </w:rPr>
-        <w:t xml:space="preserve">ساختار صنعت مواد غذایی ایران نیز بر همین الگو استوار است. </w:t>
-      </w:r>
-      <w:r>
-        <w:rPr>
-          <w:rtl/>
-        </w:rPr>
-        <w:t xml:space="preserve">این صنعت، برخلاف بسیاری از صنایع بزرگ‌مقیاس، عمدتاً از بنگاه‌های کوچک و متوسط تشکیل شده و سهم قابل‌توجهی از اشتغال بخش صنعت کشور را در بر می‌گیرد (</w:t>
-      </w:r>
-      <w:r>
-        <w:rPr>
-          <w:rtl/>
-        </w:rPr>
-        <w:t xml:space="preserve">پیوست پ</w:t>
-      </w:r>
-      <w:r>
-        <w:rPr>
-          <w:rtl/>
-        </w:rPr>
-        <w:t xml:space="preserve">). </w:t>
-      </w:r>
-      <w:r>
-        <w:rPr>
-          <w:rtl/>
-        </w:rPr>
-        <w:t xml:space="preserve">این ترکیب</w:t>
-      </w:r>
-      <w:r>
-        <w:rPr>
-          <w:rtl/>
-        </w:rPr>
-        <w:t xml:space="preserve"> ساختاری به این معناست که یافته‌های نظری مربوط به آسیب‌پذیری بنگاه تک‌محصولی، نه یک بحث انتزاعی، بلکه توصیف مستقیم </w:t>
-      </w:r>
-      <w:r>
-        <w:rPr>
-          <w:rtl/>
-        </w:rPr>
-        <w:t xml:space="preserve">وضعیت شمار بزرگی از بنگاه‌های فعال در این صنعت است. از منظر جایگاه در تجارت جهانی نیز، قلی‌پور و همکاران (۱۴۰۳) در بررسی فرصت‌ها و چالش‌های تجارت محصولات غذایی ایران به بازار عمان نشان داده‌اند که ایران در ابتدای زنجیره ارزش این صنعت قرار دارد، فاقد تمایز محصول، صرفه‌های مقیاس و مزیت رقابتی کافی است و میان تجارت واقعی و ظرفیت بالقوه آن شکاف زیادی وجود دارد.</w:t>
+        <w:t xml:space="preserve">ساختار صنعت مواد غذایی ایران نیز بر همین الگو استوار است.</w:t>
+      </w:r>
+      <w:r>
+        <w:rPr>
+          <w:rtl/>
+        </w:rPr>
+        <w:t xml:space="preserve"> این صنعت، برخلاف بسیاری از صنایع بزرگ‌مقیاس، عمدتاً از بنگاه‌های کوچک و متوسط تشکیل شده و سهم قابل‌توجهی از اشتغال بخش صنعت کشور را در بر می‌گیرد.</w:t>
+      </w:r>
+      <w:r>
+        <w:rPr>
+          <w:rtl/>
+        </w:rPr>
+        <w:t xml:space="preserve"> این ترکیب ساختاری به این معناست که یافته‌های نظری مربوط به آسیب‌پذیری بنگاه تک‌محصولی، نه یک بحث انتزاعی، بلکه توصیف مستقیم وضعیت شمار بزرگی از بنگاه‌های فعال در این صنعت است.</w:t>
+      </w:r>
+      <w:r>
+        <w:rPr>
+          <w:rtl/>
+        </w:rPr>
+        <w:t xml:space="preserve"> از منظر جایگاه در تجارت جهانی نیز، قلی‌پور و همکاران (۱۴۰۳) در بررسی فرصت‌ها و چالش‌های تجارت محصولات غذایی ایران به بازار عمان نشان داده‌اند که ایران در ابتدای زنجیره ارزش این صنعت قرار دارد، فاقد تمایز محصول، صرفه‌های مقیاس و مزیت رقابتی کافی است و میان تجارت واقعی و ظرفیت بالقوه آن شکاف زیادی وجود دارد.</w:t>
       </w:r>
     </w:p>
     <w:p>

</xml_diff>